<commit_message>
docs: actualizar requisitos de hardware con justificacion y storage 2->3 GB
</commit_message>
<xml_diff>
--- a/docs/Manual_Instalacion.docx
+++ b/docs/Manual_Instalacion.docx
@@ -46,7 +46,7 @@
         <w:pStyle w:val="ListBullet"/>
       </w:pPr>
       <w:r>
-        <w:t>CPU: 2 núcleos</w:t>
+        <w:t>CPU: 2 núcleos — suficiente para el proceso Python del tablero y la API FastAPI, que no requieren cómputo paralelo intensivo en tiempo de ejecución.</w:t>
       </w:r>
     </w:p>
     <w:p>
@@ -54,7 +54,7 @@
         <w:pStyle w:val="ListBullet"/>
       </w:pPr>
       <w:r>
-        <w:t>RAM: 4 GB</w:t>
+        <w:t>RAM: 4 GB — la matriz de features (features_mensual.parquet) ocupa ~143 MB en memoria; sumado al overhead de Python, Dash y la API FastAPI, el uso total en ejecución es de ~900 MB; 4 GB deja margen adecuado para el sistema operativo.</w:t>
       </w:r>
     </w:p>
     <w:p>
@@ -62,7 +62,7 @@
         <w:pStyle w:val="ListBullet"/>
       </w:pPr>
       <w:r>
-        <w:t>Almacenamiento libre: 2 GB</w:t>
+        <w:t>Almacenamiento libre: 3 GB — las imágenes Docker con dependencias (Python, pandas, XGBoost, Dash) pesan ~2–2.5 GB; los archivos de datos de ejecución (parquets + modelo) suman ~60 MB adicionales.</w:t>
       </w:r>
     </w:p>
     <w:p>

</xml_diff>

<commit_message>
docs: quitar em-dashes, bibliografía a color auto, quitar ejemplo localhost
</commit_message>
<xml_diff>
--- a/docs/Manual_Instalacion.docx
+++ b/docs/Manual_Instalacion.docx
@@ -46,7 +46,7 @@
         <w:pStyle w:val="ListBullet"/>
       </w:pPr>
       <w:r>
-        <w:t>CPU: 2 núcleos — suficiente para el proceso Python del tablero y la API FastAPI, que no requieren cómputo paralelo intensivo en tiempo de ejecución.</w:t>
+        <w:t>CPU: 2 núcleos; suficiente para el proceso Python del tablero y la API FastAPI, que no requieren cómputo paralelo intensivo en tiempo de ejecución.</w:t>
       </w:r>
     </w:p>
     <w:p>
@@ -54,7 +54,7 @@
         <w:pStyle w:val="ListBullet"/>
       </w:pPr>
       <w:r>
-        <w:t>RAM: 4 GB — la matriz de features (features_mensual.parquet) ocupa ~143 MB en memoria; sumado al overhead de Python, Dash y la API FastAPI, el uso total en ejecución es de ~900 MB; 4 GB deja margen adecuado para el sistema operativo.</w:t>
+        <w:t>RAM: 4 GB; la matriz de features (features_mensual.parquet) ocupa ~143 MB en memoria; sumado al overhead de Python, Dash y la API FastAPI, el uso total en ejecución es de ~900 MB; 4 GB deja margen adecuado para el sistema operativo.</w:t>
       </w:r>
     </w:p>
     <w:p>
@@ -62,7 +62,7 @@
         <w:pStyle w:val="ListBullet"/>
       </w:pPr>
       <w:r>
-        <w:t>Almacenamiento libre: 3 GB — las imágenes Docker con dependencias (Python, pandas, XGBoost, Dash) pesan ~2–2.5 GB; los archivos de datos de ejecución (parquets + modelo) suman ~60 MB adicionales.</w:t>
+        <w:t>Almacenamiento libre: 3 GB; las imágenes Docker con dependencias (Python, pandas, XGBoost, Dash) pesan ~2–2.5 GB; los archivos de datos de ejecución (parquets + modelo) suman ~60 MB adicionales.</w:t>
       </w:r>
     </w:p>
     <w:p>

</xml_diff>